<commit_message>
Expand EIN press release to 900-word AI roof-risk angle.
Update headline, contractor and homeowner narrative, multiple databloomer.com links, and regenerate txt/docx assets. Remove transient Word lock file from marketing folder.

Co-authored-by: Cursor <cursoragent@cursor.com>
</commit_message>
<xml_diff>
--- a/marketing/press-releases/ein-miami-dade-aging-roof-index-2026.docx
+++ b/marketing/press-releases/ein-miami-dade-aging-roof-index-2026.docx
@@ -19,7 +19,7 @@
           <w:b/>
           <w:sz w:val="28"/>
         </w:rPr>
-        <w:t>DataBloomer Publishes Miami-Dade Aging Roof Index: Top 10 ZIPs for Replacement Activity Ahead of 2026 Hurricane Season</w:t>
+        <w:t>AI Analysis of Miami-Dade Homes Identifies Properties at Elevated Risk for Roof Replacement This Hurricane Season</w:t>
       </w:r>
     </w:p>
     <w:p>
@@ -27,22 +27,24 @@
         <w:rPr>
           <w:i/>
         </w:rPr>
-        <w:t>MIAMI, Fla., June 29, 2026 — DataBloomer, the Miami-Dade roofing lead intelligence platform, today published the 2026 Miami-Dade Aging Roof Index — a county-wide analysis of where roof replacement activity is most likely to accelerate before hurricane season. The full report, including ZIP-level tables, oldest-roof rankings, and estimated re-roof costs, is available free at:</w:t>
+        <w:t>MIAMI, Fla., June 30, 2026 — DataBloomer, a Miami-Dade roofing intelligence platform, released a public analysis showing where roof replacement risk is concentrated ahead of peak hurricane season. Built from county permit and property records, the report helps homeowners and roofing contractors see where aging roof exposure is rising and where replacement activity is likely to accelerate.</w:t>
       </w:r>
     </w:p>
     <w:p>
       <w:r>
+        <w:t>The full public report is available at:</w:t>
+        <w:br/>
         <w:t>https://www.databloomer.com/reports/miami-dade-aging-roof-index-2026</w:t>
       </w:r>
     </w:p>
     <w:p>
       <w:r>
-        <w:t>The index analyzes 8,276 aging-roof properties drawn from county permit and property appraiser records. 93 homes score 80+ on DataBloomer's DataBloom Score, indicating replacement is likely in the near term. County-wide average roof age among tracked properties is 14.7 years.</w:t>
+        <w:t>DataBloomer's 2026 Miami-Dade Aging Roof Index analyzes 2,593 homes in a well-aged cohort (roofs strictly over 15 years old). In that cohort, 93 homes currently score 80+ on DataBloom Score, DataBloomer's signal for near-term replacement likelihood. Average roof age in the analyzed set is 16.8 years. The analysis is produced from Miami-Dade building permit history and property appraiser records, then modeled at ZIP level so contractors and residents can compare neighborhoods without publishing individual property identifiers in the public edition.</w:t>
       </w:r>
     </w:p>
     <w:p>
       <w:r>
-        <w:t>"Most Miami-Dade homeowners do not know their roof's permit age until an insurer or inspector flags it," said a DataBloomer spokesperson. "Contractors face the same problem at scale — which ZIPs have both old roofs and rising permit momentum? We built this index so the public can see what our subscribers work from every day."</w:t>
+        <w:t>"Hurricane season always exposes the same issue: many owners do not realize their roof is in a high-risk age band until an inspection, leak, or underwriting event forces a rushed decision," said a DataBloomer spokesperson. "This report helps contractors and homeowners act earlier, with neighborhood-level visibility, instead of reacting late under storm pressure."</w:t>
       </w:r>
     </w:p>
     <w:p>
@@ -58,7 +60,7 @@
         <w:pStyle w:val="ListNumber"/>
       </w:pPr>
       <w:r>
-        <w:t>1. ZIP 33165 (Westchester) — bloom score 79, 93 replacement-likely homes, avg roof age 21.1 years</w:t>
+        <w:t>1. ZIP 33165 (Westchester) — bloom score 83, 93 replacement-likely homes, avg roof age 21.8 years</w:t>
       </w:r>
     </w:p>
     <w:p>
@@ -66,7 +68,7 @@
         <w:pStyle w:val="ListNumber"/>
       </w:pPr>
       <w:r>
-        <w:t>2. ZIP 33142 (Miami-Dade 33142) — bloom score 75, 0 replacement-likely homes, avg roof age 15.3 years</w:t>
+        <w:t>2. ZIP 33142 (Miami-Dade 33142) — bloom score 76, 0 replacement-likely homes, avg roof age 16.8 years</w:t>
       </w:r>
     </w:p>
     <w:p>
@@ -74,33 +76,55 @@
         <w:pStyle w:val="ListNumber"/>
       </w:pPr>
       <w:r>
-        <w:t>3. ZIP 33170 (Miami-Dade 33170) — bloom score 75, 0 replacement-likely homes, avg roof age 15 years</w:t>
+        <w:t>3. ZIP 33032 (Miami-Dade 33032) — bloom score 76, 0 replacement-likely homes, avg roof age 16.2 years</w:t>
       </w:r>
     </w:p>
     <w:p>
       <w:r>
-        <w:t>The complete top 10, plus rankings for oldest average roof age and highest estimated replacement cost by ZIP, are in the full report at https://www.databloomer.com/reports/miami-dade-aging-roof-index-2026.</w:t>
-      </w:r>
-    </w:p>
-    <w:p>
-      <w:pPr>
-        <w:pStyle w:val="Heading2"/>
-      </w:pPr>
-      <w:r>
-        <w:t>Key findings available in the report include:</w:t>
+        <w:t>The complete Top 10 ZIP table, plus oldest-roof and highest-estimated-cost rankings, is in the full report at https://www.databloomer.com/reports/miami-dade-aging-roof-index-2026. Methodology and update context are published so readers can separate signal from noise in county-level data. Editors and trade readers seeking tables, rankings, and the published as-of date should use that page as the canonical source for the 2026 edition.</w:t>
       </w:r>
     </w:p>
     <w:p>
       <w:r>
-        <w:t>• Neighborhood bloom scores combining permit momentum and untapped aging inventory</w:t>
+        <w:t>For contractors, the practical use case is canvassing efficiency. Random door-knocking burns fuel and labor when outreach is not aligned to where roof risk clusters. The Aging Roof Index helps crews prioritize ZIPs where aged inventory, replacement-likely scoring, and permit momentum overlap — so teams can stage routes around higher-probability opportunities before demand spikes. Sales managers can assign neighborhoods by current risk intensity instead of anecdotal hot spots; business owners can time staffing and materials around likely replacement corridors; smaller contractors can focus limited canvassing where close rates are stronger.</w:t>
+      </w:r>
+    </w:p>
+    <w:p>
+      <w:r>
+        <w:t>For homeowners, the report is an early-warning planning tool, not a scare tactic. Roofs in later service-life years are not automatically failing, but hidden deterioration and weather-driven loss risk rise with age and deferred maintenance — amplified during hurricane season by wind, wind-driven rain, and contractor bottlenecks after storm alerts. If your neighborhood ranks high, schedule inspection and budgeting before emergency conditions compress your options on scope, financing, and contractor availability. Owners who act early generally retain more leverage on timing and vendor choice than those who wait for storm advisories or insurance non-renewal notices.</w:t>
+      </w:r>
+    </w:p>
+    <w:p>
+      <w:r>
+        <w:t>Roofing companies can use the index as a weekly planning layer: pick two or three adjacent high-index ZIPs, align canvassing with permit activity, and lead with education — roof age context and storm-readiness — rather than generic pitches. Service-first messaging tends to improve homeowner response and long-term trust in neighborhoods where multiple contractors compete. Property owners and managers can use the same data for pre-season triage: inspection sequencing, storm-prep budgets, and better questions for licensed inspectors (flashing, underlayment, wind uplift, remaining service life under South Florida exposure).</w:t>
+      </w:r>
+    </w:p>
+    <w:p>
+      <w:r>
+        <w:t>Hurricane season planning is rarely linear. A forecast shift, insurance inspection cycle, or neighborhood wind event can trigger sudden surges in estimate requests. Contractors that pre-position in risk-forward ZIPs can respond with shorter lead times; homeowners in those ZIPs can document roof condition and build a decision window before severe weather shortens material and labor availability.</w:t>
+      </w:r>
+    </w:p>
+    <w:p>
+      <w:r>
+        <w:t>The public index combines permit-derived age signals, neighborhood bloom modeling, and replacement-likelihood scoring, plus estimated job-size benchmarks where county heated-area data exists. "Elevated risk" does not mean imminent failure at every address; it means roof age, local replacement momentum, and permit behavior point to higher probability than the county baseline — a starting point for both prospecting and household planning.</w:t>
+      </w:r>
+    </w:p>
+    <w:p>
+      <w:r>
+        <w:t>Contractors moving from ZIP intelligence to route planning and lead prioritization can use DataBloomer at:</w:t>
         <w:br/>
-        <w:t>• Replacement-likely counts and average DataBloom Scores by ZIP</w:t>
+        <w:t>• Public report: https://www.databloomer.com/reports/miami-dade-aging-roof-index-2026</w:t>
         <w:br/>
-        <w:t>• Estimated re-roof job size benchmarks from county heated living area</w:t>
+        <w:t>• Platform overview: https://www.databloomer.com/about</w:t>
         <w:br/>
-        <w:t>• Guidance for homeowners considering inspection before June 2026</w:t>
+        <w:t>• Subscription: https://www.databloomer.com/subscribe</w:t>
         <w:br/>
-        <w:t>• Deployment notes for roofing contractors planning canvassing routes</w:t>
+        <w:t>• Contact: https://www.databloomer.com/contact</w:t>
+      </w:r>
+    </w:p>
+    <w:p>
+      <w:r>
+        <w:t>The public report is ZIP-level and free to read. Subscribers get expanded canvassing workflows — mapped Bloom Zones and lead-priority tools — to act on risk patterns faster. County-scale pattern detection gives contractors a better prospecting map and gives owners a clearer picture of neighborhood vulnerability before severe weather forces urgent decisions. DataBloomer emphasizes this analysis complements, not replaces, licensed inspection and contractor judgment; condition varies property to property even within the same ZIP.</w:t>
       </w:r>
     </w:p>
     <w:p>
@@ -113,7 +137,7 @@
     </w:p>
     <w:p>
       <w:r>
-        <w:t>DataBloomer (databloomer.com) is a subscription SaaS platform for Miami-Dade roofing contractors. The service ingests county building permits, property appraiser data, and code enforcement records to surface aging roof leads, Bloom Zone canvassing maps, and DataBloom Score ranking. Subscribers receive address-level leads, interactive maps, and weekly updates.</w:t>
+        <w:t>DataBloomer is a SaaS platform for Miami-Dade roofing intelligence. It ingests county building permits, property appraiser records, and related housing data to surface aging-roof patterns, replacement likelihood, and canvassing-oriented neighborhood signals for contractors and property owners. Learn more at https://www.databloomer.com.</w:t>
       </w:r>
     </w:p>
     <w:p>
@@ -139,11 +163,8 @@
       </w:r>
     </w:p>
     <w:p>
-      <w:pPr>
-        <w:pStyle w:val="Heading2"/>
-      </w:pPr>
       <w:r>
-        <w:t>Note to editors: High-resolution map screenshots and methodology detail available on request. Link to full report: https://www.databloomer.com/reports/miami-dade-aging-roof-index-2026</w:t>
+        <w:t>Editor note: EIN plans differ on hyperlink count and formatting. If needed for your plan tier, retain the primary report link (https://www.databloomer.com/reports/miami-dade-aging-roof-index-2026) and include additional DataBloomer links in plain text.</w:t>
       </w:r>
     </w:p>
     <w:sectPr>

</xml_diff>